<commit_message>
court(scctapp): second pass on the shared model: answering and reply engines regenerated (LaTeX now line for line), covers fill as the old templates did; opening typst re-rendered (fb-595.54.67)
Co-Authored-By: Claude Opus 5.5 <noreply@anthropic.com>
</commit_message>
<xml_diff>
--- a/courts/fourth-circuit/south-carolina/state/court-of-appeals/answering-brief/usage/OUTPUT-answering-brief.docx
+++ b/courts/fourth-circuit/south-carolina/state/court-of-appeals/answering-brief/usage/OUTPUT-answering-brief.docx
@@ -483,7 +483,12 @@
     </w:tbl>
     <w:p>
       <w:pPr>
-        <w:spacing w:before="1440" w:after="0" w:line="276" w:lineRule="exact"/>
+        <w:spacing w:before="0" w:after="0" w:line="2148" w:lineRule="exact"/>
+      </w:pPr>
+    </w:p>
+    <w:p>
+      <w:pPr>
+        <w:spacing w:before="0" w:after="0" w:line="276" w:lineRule="exact"/>
         <w:ind w:left="0" w:firstLine="0"/>
         <w:jc w:val="center"/>
       </w:pPr>
@@ -637,7 +642,12 @@
     </w:p>
     <w:p>
       <w:pPr>
-        <w:spacing w:before="1440" w:after="0" w:line="276" w:lineRule="exact"/>
+        <w:spacing w:before="0" w:after="0" w:line="2148" w:lineRule="exact"/>
+      </w:pPr>
+    </w:p>
+    <w:p>
+      <w:pPr>
+        <w:spacing w:before="0" w:after="0" w:line="276" w:lineRule="exact"/>
         <w:ind w:left="4608" w:firstLine="0"/>
         <w:jc w:val="left"/>
       </w:pPr>
@@ -5993,19 +6003,7 @@
         <w:t xml:space="preserve"> </w:t>
       </w:r>
       <w:r>
-        <w:t xml:space="preserve">(“APA”), S.C. Code Ann. § 1</w:t>
-      </w:r>
-      <w:r>
-        <w:noBreakHyphen/>
-      </w:r>
-      <w:r>
-        <w:t xml:space="preserve">23</w:t>
-      </w:r>
-      <w:r>
-        <w:noBreakHyphen/>
-      </w:r>
-      <w:r>
-        <w:t xml:space="preserve">380(A)⁠(5),</w:t>
+        <w:t xml:space="preserve">(“APA”), S.C. Code Ann. § 1-⁠23-⁠380(A)⁠(5),</w:t>
       </w:r>
       <w:r>
         <w:t xml:space="preserve"> </w:t>
@@ -6152,7 +6150,7 @@
         <w:pStyle w:val="BodyTextNote"/>
       </w:pPr>
       <w:r>
-        <w:t xml:space="preserve">Service Commission does not have the statutory authority to grant monetary damages. . .” (R. p. 2).</w:t>
+        <w:t xml:space="preserve">Service Commission does not have the statutory authority to grant monetary damages. . .” (R. p. 2).</w:t>
       </w:r>
       <w:r>
         <w:rPr>
@@ -6429,19 +6427,7 @@
         <w:t xml:space="preserve"> </w:t>
       </w:r>
       <w:r>
-        <w:t xml:space="preserve">(R. p. 74) regarding the interruptions of their water and sewer services. On the same day of receiving the Halwigs’ complaint, Respondent ORS’s Consumer Services Department, pursuant to S.C. Code Ann. § 58</w:t>
-      </w:r>
-      <w:r>
-        <w:noBreakHyphen/>
-      </w:r>
-      <w:r>
-        <w:t xml:space="preserve">4</w:t>
-      </w:r>
-      <w:r>
-        <w:noBreakHyphen/>
-      </w:r>
-      <w:r>
-        <w:t xml:space="preserve">50 (2019)</w:t>
+        <w:t xml:space="preserve">(R. p. 74) regarding the interruptions of their water and sewer services. On the same day of receiving the Halwigs’ complaint, Respondent ORS’s Consumer Services Department, pursuant to S.C. Code Ann. § 58-⁠4-⁠50 (2019)</w:t>
       </w:r>
       <w:r>
         <w:rPr>
@@ -7246,87 +7232,51 @@
         <w:pStyle w:val="BodyText"/>
       </w:pPr>
       <w:r>
-        <w:t xml:space="preserve">The Commission’s jurisdictional authority does not include the awarding of monetary damages or resolution of private contract disputes involving public utilities; rather, it is “to supervise and regulate the rates and services of every public utility in this State and to fix just and reasonable standards, classifications, regulations, practices, and measurements of service to be furnished, imposed, or observed, and followed by every public utility in this State.” S.C. Code Ann. § 58</w:t>
+        <w:t xml:space="preserve">The Commission’s jurisdictional authority does not include the awarding of monetary damages or resolution of private contract disputes involving public utilities; rather, it is “to supervise and regulate the rates and services of every public utility in this State and to fix just and reasonable standards, classifications, regulations, practices, and measurements of service to be furnished, imposed, or observed, and followed by every public utility in this State.” S.C. Code Ann. § 58-⁠3-⁠140(A)</w:t>
+      </w:r>
+      <w:r>
+        <w:t xml:space="preserve"> </w:t>
+      </w:r>
+      <w:r>
+        <w:t xml:space="preserve">(2015). “The Public Service Commission is hereby, to the extent granted, vested with power and jurisdiction to supervise and regulate the rates and services of every public utility in this State….” S.C. Code Ann. § 58-⁠5-⁠210</w:t>
+      </w:r>
+      <w:r>
+        <w:t xml:space="preserve"> </w:t>
+      </w:r>
+      <w:r>
+        <w:t xml:space="preserve">(2015) (emphasis added).</w:t>
+      </w:r>
+    </w:p>
+    <w:p>
+      <w:pPr>
+        <w:pStyle w:val="BodyText"/>
+      </w:pPr>
+      <w:r>
+        <w:t xml:space="preserve">As the Commission properly determined in Order No. 2019</w:t>
       </w:r>
       <w:r>
         <w:noBreakHyphen/>
       </w:r>
       <w:r>
-        <w:t xml:space="preserve">3</w:t>
+        <w:t xml:space="preserve">523,</w:t>
+      </w:r>
+      <w:r>
+        <w:t xml:space="preserve"> </w:t>
+      </w:r>
+      <w:r>
+        <w:t xml:space="preserve">its statutory authority permits it to order a water or sewer utility to provide “adequate” service to its customers. It has no additional statutory authority to award damages for a utility’s alleged failure to provide “adequate” service. Commission Order No. 2019</w:t>
       </w:r>
       <w:r>
         <w:noBreakHyphen/>
       </w:r>
       <w:r>
-        <w:t xml:space="preserve">140(A)</w:t>
-      </w:r>
-      <w:r>
-        <w:t xml:space="preserve"> </w:t>
-      </w:r>
-      <w:r>
-        <w:t xml:space="preserve">(2015). “The Public Service Commission is hereby, to the extent granted, vested with power and jurisdiction to supervise and regulate the rates and services of every public utility in this State….” S.C. Code Ann. § 58</w:t>
-      </w:r>
-      <w:r>
-        <w:noBreakHyphen/>
-      </w:r>
-      <w:r>
-        <w:t xml:space="preserve">5</w:t>
-      </w:r>
-      <w:r>
-        <w:noBreakHyphen/>
-      </w:r>
-      <w:r>
-        <w:t xml:space="preserve">210</w:t>
-      </w:r>
-      <w:r>
-        <w:t xml:space="preserve"> </w:t>
-      </w:r>
-      <w:r>
-        <w:t xml:space="preserve">(2015) (emphasis added).</w:t>
-      </w:r>
-    </w:p>
-    <w:p>
-      <w:pPr>
-        <w:pStyle w:val="BodyText"/>
-      </w:pPr>
-      <w:r>
-        <w:t xml:space="preserve">As the Commission properly determined in Order No. 2019</w:t>
-      </w:r>
-      <w:r>
-        <w:noBreakHyphen/>
-      </w:r>
-      <w:r>
-        <w:t xml:space="preserve">523,</w:t>
-      </w:r>
-      <w:r>
-        <w:t xml:space="preserve"> </w:t>
-      </w:r>
-      <w:r>
-        <w:t xml:space="preserve">its statutory authority permits it to order a water or sewer utility to provide “adequate” service to its customers. It has no additional statutory authority to award damages for a utility’s alleged failure to provide “adequate” service. Commission Order No. 2019</w:t>
-      </w:r>
-      <w:r>
-        <w:noBreakHyphen/>
-      </w:r>
-      <w:r>
         <w:t xml:space="preserve">523</w:t>
       </w:r>
       <w:r>
         <w:t xml:space="preserve"> </w:t>
       </w:r>
       <w:r>
-        <w:t xml:space="preserve">holds, “The Commission does have authority under [S.C. Code Ann. § 58</w:t>
-      </w:r>
-      <w:r>
-        <w:noBreakHyphen/>
-      </w:r>
-      <w:r>
-        <w:t xml:space="preserve">5]</w:t>
-      </w:r>
-      <w:r>
-        <w:noBreakHyphen/>
-      </w:r>
-      <w:r>
-        <w:t xml:space="preserve">710 to levy a fine or penalty against a regulated utility if the utility is failing to show cause as to why it is not taking steps to provide adequate water and sewer service. As I mentioned earlier, service has been and is continuing to be rendered to the Complainants. Even if that weren’t the case, any fines or penalties levied by this Commission go into the General Fund of the State, not to the Complainants.” (R. p. 4).</w:t>
+        <w:t xml:space="preserve">holds, “The Commission does have authority under [S.C. Code Ann. § 58-⁠5]-⁠710 to levy a fine or penalty against a regulated utility if the utility is failing to show cause as to why it is not taking steps to provide adequate water and sewer service. As I mentioned earlier, service has been and is continuing to be rendered to the Complainants. Even if that weren’t the case, any fines or penalties levied by this Commission go into the General Fund of the State, not to the Complainants.” (R. p. 4).</w:t>
       </w:r>
     </w:p>
     <w:p>
@@ -7884,19 +7834,219 @@
         <w:pStyle w:val="BodyText"/>
       </w:pPr>
       <w:r>
-        <w:t xml:space="preserve">Any complaints regarding the adequacy of service provided by a water or wastewater utility are addressed in S.C. Code Ann. § 58</w:t>
+        <w:t xml:space="preserve">Any complaints regarding the adequacy of service provided by a water or wastewater utility are addressed in S.C. Code Ann. § 58-⁠5-⁠710. The statute provides that the Commission may hear complaints alleging that a utility is not providing adequate and proper service and may order any offending utility to “take steps as are necessary to the provision of the service within a reasonable time as prescribed by the Commission.” The provisions of this act are only applicable to water and sewer utilities that are currently out of compliance with the requirement that they provide adequate service.</w:t>
+      </w:r>
+    </w:p>
+    <w:p>
+      <w:pPr>
+        <w:pStyle w:val="BodyText"/>
+      </w:pPr>
+      <w:r>
+        <w:t xml:space="preserve">As a matter of law under the standard of review established in S.C. Code Ann. § 1-⁠23-⁠380(A)⁠(5),</w:t>
+      </w:r>
+      <w:r>
+        <w:t xml:space="preserve"> </w:t>
+      </w:r>
+      <w:r>
+        <w:t xml:space="preserve">the Commission would have committed reversible error if it had attempted to grant the monetary relief requested by the Appellants. That statute specifically provides, “The court may reverse or modify the decision if substantial rights of the appellant have been prejudiced because the administrative findings, inferences, conclusions or decision are (b) in excess of the statutory authority of the agency.” (emphasis added). In the present case, the Commission simply lacks the required statutory authority to award Appellants monetary damages. It was unnecessary for the Commission to have made a finding or commented in the Orders on whether the Respondent DIUC had violated a provision of the law regarding administrative filings. The Orders of the Commission in this case do not prejudice the Appellants’ rights to allege a nexus between Respondent DIUC’s failure to file a copy of the CSA with the Commission and their seeking damages in a civil action. (R. p. 4).</w:t>
+      </w:r>
+    </w:p>
+    <w:p>
+      <w:pPr>
+        <w:pStyle w:val="BodyText"/>
+      </w:pPr>
+      <w:r>
+        <w:t xml:space="preserve">Even if the Commission had made a finding that the CSA should or shouldn’t have been filed, such a statement would be no more than an advisory opinion or mere dicta. The Parties remain free to argue the applicability of the regulations in a civil suit. “It is, of course, axiomatic that the violation of a statute (here an ordinance—interpolated), while negligence per se, will not support a recovery for damages unless such violation proximately caused or contributed to the injury complained of.”</w:t>
+      </w:r>
+      <w:r>
+        <w:t xml:space="preserve"> </w:t>
+      </w:r>
+      <w:r>
+        <w:rPr>
+          <w:i/>
+          <w:iCs/>
+        </w:rPr>
+        <w:t xml:space="preserve">Wright v. South Carolina Power</w:t>
+      </w:r>
+      <w:r>
+        <w:rPr>
+          <w:i/>
+          <w:iCs/>
+        </w:rPr>
+        <w:t xml:space="preserve"> </w:t>
+      </w:r>
+      <w:r>
+        <w:rPr>
+          <w:i/>
+          <w:iCs/>
+        </w:rPr>
+        <w:t xml:space="preserve">Co.</w:t>
+      </w:r>
+      <w:r>
+        <w:t xml:space="preserve">, 205 S.C. 327, 31 S.E.2d 904, 905 (1944) citing</w:t>
+      </w:r>
+      <w:r>
+        <w:t xml:space="preserve"> </w:t>
+      </w:r>
+      <w:r>
+        <w:rPr>
+          <w:i/>
+          <w:iCs/>
+        </w:rPr>
+        <w:t xml:space="preserve">Locklear</w:t>
+      </w:r>
+      <w:r>
+        <w:rPr>
+          <w:i/>
+          <w:iCs/>
+        </w:rPr>
+        <w:t xml:space="preserve"> </w:t>
+      </w:r>
+      <w:r>
+        <w:rPr>
+          <w:i/>
+          <w:iCs/>
+        </w:rPr>
+        <w:t xml:space="preserve">v. Southeastern Stages</w:t>
+      </w:r>
+      <w:r>
+        <w:t xml:space="preserve">, 193 S.C. 309, 8 S.E.2d 321, 324 (1940). This principle is also applicable to regulations, such as those at issue here. “Regulations are interpreted using the same rules of construction as statutes.”</w:t>
+      </w:r>
+      <w:r>
+        <w:t xml:space="preserve"> </w:t>
+      </w:r>
+      <w:r>
+        <w:rPr>
+          <w:i/>
+          <w:iCs/>
+        </w:rPr>
+        <w:t xml:space="preserve">Murphy</w:t>
+      </w:r>
+      <w:r>
+        <w:rPr>
+          <w:i/>
+          <w:iCs/>
+        </w:rPr>
+        <w:t xml:space="preserve"> </w:t>
+      </w:r>
+      <w:r>
+        <w:rPr>
+          <w:i/>
+          <w:iCs/>
+        </w:rPr>
+        <w:t xml:space="preserve">v. S.C. Dep’t of Health and Envtl. Control</w:t>
+      </w:r>
+      <w:r>
+        <w:t xml:space="preserve">, 396 S.C. 633, 639, 723 S.E.2d 191, 195 (2012);</w:t>
+      </w:r>
+      <w:r>
+        <w:t xml:space="preserve"> </w:t>
+      </w:r>
+      <w:r>
+        <w:rPr>
+          <w:i/>
+          <w:iCs/>
+        </w:rPr>
+        <w:t xml:space="preserve">see S.C. Ambulatory Surgery</w:t>
+      </w:r>
+      <w:r>
+        <w:rPr>
+          <w:i/>
+          <w:iCs/>
+        </w:rPr>
+        <w:t xml:space="preserve"> </w:t>
+      </w:r>
+      <w:r>
+        <w:rPr>
+          <w:i/>
+          <w:iCs/>
+        </w:rPr>
+        <w:t xml:space="preserve">Ctr. Ass’n v. S.C. Workers’ Comp. Comm’n</w:t>
+      </w:r>
+      <w:r>
+        <w:t xml:space="preserve">, 389 S.C. 380, 389, 699 S.E.2d 146, 151 (2010).</w:t>
+      </w:r>
+    </w:p>
+    <w:p>
+      <w:pPr>
+        <w:pStyle w:val="BodyTextNote"/>
+      </w:pPr>
+      <w:r>
+        <w:t xml:space="preserve">The Commission properly applied the rules of statutory construction in interpreting Regulations 103</w:t>
       </w:r>
       <w:r>
         <w:noBreakHyphen/>
       </w:r>
       <w:r>
-        <w:t xml:space="preserve">5</w:t>
+        <w:t xml:space="preserve">541 and 103</w:t>
       </w:r>
       <w:r>
         <w:noBreakHyphen/>
       </w:r>
       <w:r>
-        <w:t xml:space="preserve">710. The statute provides that the Commission may hear complaints alleging that a utility is not providing adequate and proper service and may order any offending utility to “take steps as are necessary to the provision of the service within a reasonable time as prescribed by the Commission.” The provisions of this act are only applicable to water and sewer utilities that are currently out of compliance with the requirement that they provide adequate service.</w:t>
+        <w:t xml:space="preserve">743, and S.C. Code Ann. § 58-⁠5-⁠710, as none of these regulations or statutes provide for or authorize the Commission to award damages.</w:t>
+      </w:r>
+      <w:r>
+        <w:rPr>
+          <w:rStyle w:val="FootnoteReference"/>
+        </w:rPr>
+        <w:footnoteReference w:id="40"/>
+      </w:r>
+      <w:r>
+        <w:t xml:space="preserve"> </w:t>
+      </w:r>
+      <w:r>
+        <w:t xml:space="preserve">“When interpreting a regulation, we look for the plain and ordinary meaning of the words of the regulation, without resort to subtle or forced construction to limit or expand [its] operation.”</w:t>
+      </w:r>
+      <w:r>
+        <w:t xml:space="preserve"> </w:t>
+      </w:r>
+      <w:r>
+        <w:rPr>
+          <w:i/>
+          <w:iCs/>
+        </w:rPr>
+        <w:t xml:space="preserve">Murphy</w:t>
+      </w:r>
+      <w:r>
+        <w:t xml:space="preserve">, 396 S.C. at 639–40, 723 S.E.2d at 195 quoting</w:t>
+      </w:r>
+      <w:r>
+        <w:t xml:space="preserve"> </w:t>
+      </w:r>
+      <w:r>
+        <w:rPr>
+          <w:i/>
+          <w:iCs/>
+        </w:rPr>
+        <w:t xml:space="preserve">Converse Power</w:t>
+      </w:r>
+      <w:r>
+        <w:rPr>
+          <w:i/>
+          <w:iCs/>
+        </w:rPr>
+        <w:t xml:space="preserve"> </w:t>
+      </w:r>
+      <w:r>
+        <w:rPr>
+          <w:i/>
+          <w:iCs/>
+        </w:rPr>
+        <w:t xml:space="preserve">Corp. v. S.C. Dep’t of Health &amp; Envtl. Control</w:t>
+      </w:r>
+      <w:r>
+        <w:t xml:space="preserve">, 350 S.C. 39, 47, 564 S.E.2d 341, 346 (Ct. App. 2002). While the Commission does have limited authority under S.C. Code Ann. § 58-⁠5-⁠710 to levy fines or penalties against a utility which fails to provide adequate water or sewer service, the express terms of the regulation specifically prohibit any such fines or penalties being awarded to any party as “Any fine or penalty so imposed by the commission shall go into the general fund of the State, unless otherwise provided by law.”</w:t>
+      </w:r>
+      <w:r>
+        <w:t xml:space="preserve"> </w:t>
+      </w:r>
+      <w:r>
+        <w:rPr>
+          <w:i/>
+          <w:iCs/>
+        </w:rPr>
+        <w:t xml:space="preserve">Id.</w:t>
       </w:r>
     </w:p>
     <w:p>
@@ -7904,25 +8054,160 @@
         <w:pStyle w:val="BodyText"/>
       </w:pPr>
       <w:r>
-        <w:t xml:space="preserve">As a matter of law under the standard of review established in S.C. Code Ann. § 1</w:t>
+        <w:t xml:space="preserve">The Court should give proper deference to the Commission’s ruling that it lacks subject matter jurisdiction to hear a dispute where one of the parties is seeking a monetary award based on a contractual issue. “We give deference to the interpretation of a regulation by the agency charged with it [sic] enforcement.”</w:t>
+      </w:r>
+      <w:r>
+        <w:t xml:space="preserve"> </w:t>
+      </w:r>
+      <w:r>
+        <w:rPr>
+          <w:i/>
+          <w:iCs/>
+        </w:rPr>
+        <w:t xml:space="preserve">Murphy</w:t>
+      </w:r>
+      <w:r>
+        <w:t xml:space="preserve">, at 640, 723 S.E.2d at 195,</w:t>
+      </w:r>
+      <w:r>
+        <w:t xml:space="preserve"> </w:t>
+      </w:r>
+      <w:r>
+        <w:rPr>
+          <w:i/>
+          <w:iCs/>
+        </w:rPr>
+        <w:t xml:space="preserve">see also</w:t>
+      </w:r>
+      <w:r>
+        <w:t xml:space="preserve">,</w:t>
+      </w:r>
+      <w:r>
+        <w:t xml:space="preserve"> </w:t>
+      </w:r>
+      <w:r>
+        <w:rPr>
+          <w:i/>
+          <w:iCs/>
+        </w:rPr>
+        <w:t xml:space="preserve">Sloan v.</w:t>
+      </w:r>
+      <w:r>
+        <w:rPr>
+          <w:i/>
+          <w:iCs/>
+        </w:rPr>
+        <w:t xml:space="preserve"> </w:t>
+      </w:r>
+      <w:r>
+        <w:rPr>
+          <w:i/>
+          <w:iCs/>
+        </w:rPr>
+        <w:t xml:space="preserve">S.C. Bd. of Physical Therapy Exam’rs</w:t>
+      </w:r>
+      <w:r>
+        <w:t xml:space="preserve">, 370 S.C. 452, 469, 636 S.E.2d 598, 607 (2006). (“The construction of a statute by an agency charged with its administration is entitled to the most respectful consideration and should not be overruled absent compelling reasons.”) No party is better suited to interpret the regulations of the Commission than the Commission itself. “The Public Service Commission has been given authority to supervise and regulate the service of public utilities and to fix just and reasonable standards and regulations. It’s reasonable rules and regulations when properly filed and published have the power and effect of law….”</w:t>
+      </w:r>
+      <w:r>
+        <w:t xml:space="preserve"> </w:t>
+      </w:r>
+      <w:r>
+        <w:rPr>
+          <w:i/>
+          <w:iCs/>
+        </w:rPr>
+        <w:t xml:space="preserve">Woody v.</w:t>
+      </w:r>
+      <w:r>
+        <w:rPr>
+          <w:i/>
+          <w:iCs/>
+        </w:rPr>
+        <w:t xml:space="preserve"> </w:t>
+      </w:r>
+      <w:r>
+        <w:rPr>
+          <w:i/>
+          <w:iCs/>
+        </w:rPr>
+        <w:t xml:space="preserve">South Carolina Power Co.</w:t>
+      </w:r>
+      <w:r>
+        <w:t xml:space="preserve">, 202 S.C. 73, 24 S.E.2d 121 at 123 (1943).</w:t>
+      </w:r>
+    </w:p>
+    <w:p>
+      <w:pPr>
+        <w:pStyle w:val="BodyText"/>
+      </w:pPr>
+      <w:r>
+        <w:t xml:space="preserve">Appellants are not prejudiced by the Orders of the Commission in their efforts to challenge the terms and conditions of the CSA or to obtain monetary damages in a civil action against Respondent DIUC. The Commission was not required to address the underlying claim of Respondent DIUC’s compliance with Commission statutes and regulations in not filing for approval a copy of the CSA. Even if the Appellants had raised the issue before the Commission, and the Commission had ruled that Respondent DIUC was in violation of the applicable statutes and regulations in not filing for approval, the Commission still could not have awarded damages. Regulatory compliance has no bearing on the Commission’s inability to award damages or order restoration of service when service was previously restored.</w:t>
+      </w:r>
+    </w:p>
+    <w:p>
+      <w:pPr>
+        <w:pStyle w:val="BodyText"/>
+      </w:pPr>
+      <w:r>
+        <w:t xml:space="preserve">The underlying monetary damages claim of the Appellants could create a possible improper result that the Commission would order, through increased rates, that other customers of Respondent DIUC pay for the restoration of service to Appellants homes if those residences were severely damaged by a hurricane.</w:t>
+      </w:r>
+    </w:p>
+    <w:p>
+      <w:pPr>
+        <w:pStyle w:val="BodyText"/>
+      </w:pPr>
+      <w:r>
+        <w:t xml:space="preserve">Pursuant to S.C. Code Ann. § 58-⁠5-⁠710, a water and sewer utility does have a duty to provide “adequate and proper service to its customers.” However, the statute, as well as the regulations, do not provide for awarding damages to a customer for the utility’s alleged failure to provide adequate service and remain completely silent as to the timeframe in which service must be provided or restored. If the statute or regulation “is silent or ambiguous with respect to the specific issue,” the court then must give deference to the agency’s interpretation of the statute or regulation.</w:t>
+      </w:r>
+      <w:r>
+        <w:t xml:space="preserve"> </w:t>
+      </w:r>
+      <w:r>
+        <w:rPr>
+          <w:i/>
+          <w:iCs/>
+        </w:rPr>
+        <w:t xml:space="preserve">Kiawah Development Partners,</w:t>
+      </w:r>
+      <w:r>
+        <w:rPr>
+          <w:i/>
+          <w:iCs/>
+        </w:rPr>
+        <w:t xml:space="preserve"> </w:t>
+      </w:r>
+      <w:r>
+        <w:rPr>
+          <w:i/>
+          <w:iCs/>
+        </w:rPr>
+        <w:t xml:space="preserve">II v. South Carolina Dept. of Health and Environmental Control</w:t>
+      </w:r>
+      <w:r>
+        <w:t xml:space="preserve">, 411 S.C. 16, 33, 766 S.E.2d 707, 717 (2014).</w:t>
+      </w:r>
+    </w:p>
+    <w:p>
+      <w:pPr>
+        <w:pStyle w:val="BodyText"/>
+      </w:pPr>
+      <w:r>
+        <w:t xml:space="preserve">There is and was no issue as to a lack of service provided to the Appellants’ residences at the time the Commission ruled on this case, as their service was previously restored in December 2018. (R. p. 4). Due to the Appellants’ water and sewer services being restored, that issue was moot prior to the time the Commission made its ruling in this case. (R. p. 4).</w:t>
+      </w:r>
+    </w:p>
+    <w:p>
+      <w:pPr>
+        <w:pStyle w:val="BodyText"/>
+      </w:pPr>
+      <w:r>
+        <w:t xml:space="preserve">The fact that a contract was not timely filed with the Commission (there is no specific time requirement in the Regulation) cannot and does not confer jurisdiction on the Appellants’ demand for monetary damages. Even if the Commission’s regulations required it to address the Appellants’ complaint regarding Respondent DIUC’s alleged failure to file the CSA, the Commission could, on Respondent DIUC’s Motion, waive the contract approval requirement provided in Regulation 103</w:t>
       </w:r>
       <w:r>
         <w:noBreakHyphen/>
       </w:r>
       <w:r>
-        <w:t xml:space="preserve">23</w:t>
-      </w:r>
-      <w:r>
-        <w:noBreakHyphen/>
-      </w:r>
-      <w:r>
-        <w:t xml:space="preserve">380(A)⁠(5),</w:t>
-      </w:r>
-      <w:r>
-        <w:t xml:space="preserve"> </w:t>
-      </w:r>
-      <w:r>
-        <w:t xml:space="preserve">the Commission would have committed reversible error if it had attempted to grant the monetary relief requested by the Appellants. That statute specifically provides, “The court may reverse or modify the decision if substantial rights of the appellant have been prejudiced because the administrative findings, inferences, conclusions or decision are (b) in excess of the statutory authority of the agency.” (emphasis added). In the present case, the Commission simply lacks the required statutory authority to award Appellants monetary damages. It was unnecessary for the Commission to have made a finding or commented in the Orders on whether the Respondent DIUC had violated a provision of the law regarding administrative filings. The Orders of the Commission in this case do not prejudice the Appellants’ rights to allege a nexus between Respondent DIUC’s failure to file a copy of the CSA with the Commission and their seeking damages in a civil action. (R. p. 4).</w:t>
+        <w:t xml:space="preserve">743, based upon the underlying facts addressing claims for monetary damages. The proper forum for Respondent DIUC and Appellants’ rights and obligations under the CSA remain in the Court of Common Pleas, not before the Commission.</w:t>
       </w:r>
     </w:p>
     <w:p>
@@ -7930,221 +8215,7 @@
         <w:pStyle w:val="BodyText"/>
       </w:pPr>
       <w:r>
-        <w:t xml:space="preserve">Even if the Commission had made a finding that the CSA should or shouldn’t have been filed, such a statement would be no more than an advisory opinion or mere dicta. The Parties remain free to argue the applicability of the regulations in a civil suit. “It is, of course, axiomatic that the violation of a statute (here an ordinance—interpolated), while negligence per se, will not support a recovery for damages unless such violation proximately caused or contributed to the injury complained of.”</w:t>
-      </w:r>
-      <w:r>
-        <w:t xml:space="preserve"> </w:t>
-      </w:r>
-      <w:r>
-        <w:rPr>
-          <w:i/>
-          <w:iCs/>
-        </w:rPr>
-        <w:t xml:space="preserve">Wright v. South Carolina Power</w:t>
-      </w:r>
-      <w:r>
-        <w:rPr>
-          <w:i/>
-          <w:iCs/>
-        </w:rPr>
-        <w:t xml:space="preserve"> </w:t>
-      </w:r>
-      <w:r>
-        <w:rPr>
-          <w:i/>
-          <w:iCs/>
-        </w:rPr>
-        <w:t xml:space="preserve">Co.</w:t>
-      </w:r>
-      <w:r>
-        <w:t xml:space="preserve">, 205 S.C. 327, 31 S.E.2d 904, 905 (1944) citing</w:t>
-      </w:r>
-      <w:r>
-        <w:t xml:space="preserve"> </w:t>
-      </w:r>
-      <w:r>
-        <w:rPr>
-          <w:i/>
-          <w:iCs/>
-        </w:rPr>
-        <w:t xml:space="preserve">Locklear</w:t>
-      </w:r>
-      <w:r>
-        <w:rPr>
-          <w:i/>
-          <w:iCs/>
-        </w:rPr>
-        <w:t xml:space="preserve"> </w:t>
-      </w:r>
-      <w:r>
-        <w:rPr>
-          <w:i/>
-          <w:iCs/>
-        </w:rPr>
-        <w:t xml:space="preserve">v. Southeastern Stages</w:t>
-      </w:r>
-      <w:r>
-        <w:t xml:space="preserve">, 193 S.C. 309, 8 S.E.2d 321, 324 (1940). This principle is also applicable to regulations, such as those at issue here. “Regulations are interpreted using the same rules of construction as statutes.”</w:t>
-      </w:r>
-      <w:r>
-        <w:t xml:space="preserve"> </w:t>
-      </w:r>
-      <w:r>
-        <w:rPr>
-          <w:i/>
-          <w:iCs/>
-        </w:rPr>
-        <w:t xml:space="preserve">Murphy</w:t>
-      </w:r>
-      <w:r>
-        <w:rPr>
-          <w:i/>
-          <w:iCs/>
-        </w:rPr>
-        <w:t xml:space="preserve"> </w:t>
-      </w:r>
-      <w:r>
-        <w:rPr>
-          <w:i/>
-          <w:iCs/>
-        </w:rPr>
-        <w:t xml:space="preserve">v. S.C. Dep’t of Health and Envtl. Control</w:t>
-      </w:r>
-      <w:r>
-        <w:t xml:space="preserve">, 396 S.C. 633, 639, 723 S.E.2d 191, 195 (2012);</w:t>
-      </w:r>
-      <w:r>
-        <w:t xml:space="preserve"> </w:t>
-      </w:r>
-      <w:r>
-        <w:rPr>
-          <w:i/>
-          <w:iCs/>
-        </w:rPr>
-        <w:t xml:space="preserve">see S.C. Ambulatory Surgery</w:t>
-      </w:r>
-      <w:r>
-        <w:rPr>
-          <w:i/>
-          <w:iCs/>
-        </w:rPr>
-        <w:t xml:space="preserve"> </w:t>
-      </w:r>
-      <w:r>
-        <w:rPr>
-          <w:i/>
-          <w:iCs/>
-        </w:rPr>
-        <w:t xml:space="preserve">Ctr. Ass’n v. S.C. Workers’ Comp. Comm’n</w:t>
-      </w:r>
-      <w:r>
-        <w:t xml:space="preserve">, 389 S.C. 380, 389, 699 S.E.2d 146, 151 (2010).</w:t>
-      </w:r>
-    </w:p>
-    <w:p>
-      <w:pPr>
-        <w:pStyle w:val="BodyTextNote"/>
-      </w:pPr>
-      <w:r>
-        <w:t xml:space="preserve">The Commission properly applied the rules of statutory construction in interpreting Regulations 103</w:t>
-      </w:r>
-      <w:r>
-        <w:noBreakHyphen/>
-      </w:r>
-      <w:r>
-        <w:t xml:space="preserve">541 and 103</w:t>
-      </w:r>
-      <w:r>
-        <w:noBreakHyphen/>
-      </w:r>
-      <w:r>
-        <w:t xml:space="preserve">743, and S.C. Code Ann. § 58</w:t>
-      </w:r>
-      <w:r>
-        <w:noBreakHyphen/>
-      </w:r>
-      <w:r>
-        <w:t xml:space="preserve">5</w:t>
-      </w:r>
-      <w:r>
-        <w:noBreakHyphen/>
-      </w:r>
-      <w:r>
-        <w:t xml:space="preserve">710, as none of these regulations or statutes provide for or authorize the Commission to award damages.</w:t>
-      </w:r>
-      <w:r>
-        <w:rPr>
-          <w:rStyle w:val="FootnoteReference"/>
-        </w:rPr>
-        <w:footnoteReference w:id="40"/>
-      </w:r>
-      <w:r>
-        <w:t xml:space="preserve"> </w:t>
-      </w:r>
-      <w:r>
-        <w:t xml:space="preserve">“When interpreting a regulation, we look for the plain and ordinary meaning of the words of the regulation, without resort to subtle or forced construction to limit or expand [its] operation.”</w:t>
-      </w:r>
-      <w:r>
-        <w:t xml:space="preserve"> </w:t>
-      </w:r>
-      <w:r>
-        <w:rPr>
-          <w:i/>
-          <w:iCs/>
-        </w:rPr>
-        <w:t xml:space="preserve">Murphy</w:t>
-      </w:r>
-      <w:r>
-        <w:t xml:space="preserve">, 396 S.C. at 639–40, 723 S.E.2d at 195 quoting</w:t>
-      </w:r>
-      <w:r>
-        <w:t xml:space="preserve"> </w:t>
-      </w:r>
-      <w:r>
-        <w:rPr>
-          <w:i/>
-          <w:iCs/>
-        </w:rPr>
-        <w:t xml:space="preserve">Converse Power</w:t>
-      </w:r>
-      <w:r>
-        <w:rPr>
-          <w:i/>
-          <w:iCs/>
-        </w:rPr>
-        <w:t xml:space="preserve"> </w:t>
-      </w:r>
-      <w:r>
-        <w:rPr>
-          <w:i/>
-          <w:iCs/>
-        </w:rPr>
-        <w:t xml:space="preserve">Corp. v. S.C. Dep’t of Health &amp; Envtl. Control</w:t>
-      </w:r>
-      <w:r>
-        <w:t xml:space="preserve">, 350 S.C. 39, 47, 564 S.E.2d 341, 346 (Ct. App. 2002). While the Commission does have limited authority under S.C. Code Ann. § 58</w:t>
-      </w:r>
-      <w:r>
-        <w:noBreakHyphen/>
-      </w:r>
-      <w:r>
-        <w:t xml:space="preserve">5</w:t>
-      </w:r>
-      <w:r>
-        <w:noBreakHyphen/>
-      </w:r>
-      <w:r>
-        <w:t xml:space="preserve">710 to levy fines or penalties against a utility which fails to provide adequate water or sewer service, the express terms of the regulation specifically prohibit any such fines or penalties being awarded to any party as “Any fine or penalty so imposed by the commission shall go into the general fund of the State, unless otherwise provided by law.”</w:t>
-      </w:r>
-      <w:r>
-        <w:t xml:space="preserve"> </w:t>
-      </w:r>
-      <w:r>
-        <w:rPr>
-          <w:i/>
-          <w:iCs/>
-        </w:rPr>
-        <w:t xml:space="preserve">Id.</w:t>
+        <w:t xml:space="preserve">The Commission was not required to address the issue of restoration of service for two substantial reasons: (1) service had already been restored by the time the case reached the Commission, therefore making the issue moot, and (2) the issue of a contract being filed with the Commission had no impact on the areas that the Commission does have jurisdiction– namely the actual provision of service. The Commission did not need to address the issue of the propriety of the terms of the CSA between the Appellants and Respondent DIUC not being filed with the Commission, as it has no statutory authority to award the monetary damages sought by the Appellants in their Complaint. There is no specific statutory relief fine or other regulatory action which the Commission is authorized to impose on a utility for failure to file a contract with the Commission.</w:t>
       </w:r>
     </w:p>
     <w:p>
@@ -8152,212 +8223,7 @@
         <w:pStyle w:val="BodyText"/>
       </w:pPr>
       <w:r>
-        <w:t xml:space="preserve">The Court should give proper deference to the Commission’s ruling that it lacks subject matter jurisdiction to hear a dispute where one of the parties is seeking a monetary award based on a contractual issue. “We give deference to the interpretation of a regulation by the agency charged with it [sic] enforcement.”</w:t>
-      </w:r>
-      <w:r>
-        <w:t xml:space="preserve"> </w:t>
-      </w:r>
-      <w:r>
-        <w:rPr>
-          <w:i/>
-          <w:iCs/>
-        </w:rPr>
-        <w:t xml:space="preserve">Murphy</w:t>
-      </w:r>
-      <w:r>
-        <w:t xml:space="preserve">, at 640, 723 S.E.2d at 195,</w:t>
-      </w:r>
-      <w:r>
-        <w:t xml:space="preserve"> </w:t>
-      </w:r>
-      <w:r>
-        <w:rPr>
-          <w:i/>
-          <w:iCs/>
-        </w:rPr>
-        <w:t xml:space="preserve">see also</w:t>
-      </w:r>
-      <w:r>
-        <w:t xml:space="preserve">,</w:t>
-      </w:r>
-      <w:r>
-        <w:t xml:space="preserve"> </w:t>
-      </w:r>
-      <w:r>
-        <w:rPr>
-          <w:i/>
-          <w:iCs/>
-        </w:rPr>
-        <w:t xml:space="preserve">Sloan v.</w:t>
-      </w:r>
-      <w:r>
-        <w:rPr>
-          <w:i/>
-          <w:iCs/>
-        </w:rPr>
-        <w:t xml:space="preserve"> </w:t>
-      </w:r>
-      <w:r>
-        <w:rPr>
-          <w:i/>
-          <w:iCs/>
-        </w:rPr>
-        <w:t xml:space="preserve">S.C. Bd. of Physical Therapy Exam’rs</w:t>
-      </w:r>
-      <w:r>
-        <w:t xml:space="preserve">, 370 S.C. 452, 469, 636 S.E.2d 598, 607 (2006). (“The construction of a statute by an agency charged with its administration is entitled to the most respectful consideration and should not be overruled absent compelling reasons.”) No party is better suited to interpret the regulations of the Commission than the Commission itself. “The Public Service Commission has been given authority to supervise and regulate the service of public utilities and to fix just and reasonable standards and regulations. It’s reasonable rules and regulations when properly filed and published have the power and effect of law….”</w:t>
-      </w:r>
-      <w:r>
-        <w:t xml:space="preserve"> </w:t>
-      </w:r>
-      <w:r>
-        <w:rPr>
-          <w:i/>
-          <w:iCs/>
-        </w:rPr>
-        <w:t xml:space="preserve">Woody v.</w:t>
-      </w:r>
-      <w:r>
-        <w:rPr>
-          <w:i/>
-          <w:iCs/>
-        </w:rPr>
-        <w:t xml:space="preserve"> </w:t>
-      </w:r>
-      <w:r>
-        <w:rPr>
-          <w:i/>
-          <w:iCs/>
-        </w:rPr>
-        <w:t xml:space="preserve">South Carolina Power Co.</w:t>
-      </w:r>
-      <w:r>
-        <w:t xml:space="preserve">, 202 S.C. 73, 24 S.E.2d 121 at 123 (1943).</w:t>
-      </w:r>
-    </w:p>
-    <w:p>
-      <w:pPr>
-        <w:pStyle w:val="BodyText"/>
-      </w:pPr>
-      <w:r>
-        <w:t xml:space="preserve">Appellants are not prejudiced by the Orders of the Commission in their efforts to challenge the terms and conditions of the CSA or to obtain monetary damages in a civil action against Respondent DIUC. The Commission was not required to address the underlying claim of Respondent DIUC’s compliance with Commission statutes and regulations in not filing for approval a copy of the CSA. Even if the Appellants had raised the issue before the Commission, and the Commission had ruled that Respondent DIUC was in violation of the applicable statutes and regulations in not filing for approval, the Commission still could not have awarded damages. Regulatory compliance has no bearing on the Commission’s inability to award damages or order restoration of service when service was previously restored.</w:t>
-      </w:r>
-    </w:p>
-    <w:p>
-      <w:pPr>
-        <w:pStyle w:val="BodyText"/>
-      </w:pPr>
-      <w:r>
-        <w:t xml:space="preserve">The underlying monetary damages claim of the Appellants could create a possible improper result that the Commission would order, through increased rates, that other customers of Respondent DIUC pay for the restoration of service to Appellants homes if those residences were severely damaged by a hurricane.</w:t>
-      </w:r>
-    </w:p>
-    <w:p>
-      <w:pPr>
-        <w:pStyle w:val="BodyText"/>
-      </w:pPr>
-      <w:r>
-        <w:t xml:space="preserve">Pursuant to S.C. Code Ann. § 58</w:t>
-      </w:r>
-      <w:r>
-        <w:noBreakHyphen/>
-      </w:r>
-      <w:r>
-        <w:t xml:space="preserve">5</w:t>
-      </w:r>
-      <w:r>
-        <w:noBreakHyphen/>
-      </w:r>
-      <w:r>
-        <w:t xml:space="preserve">710, a water and sewer utility does have a duty to provide “adequate and proper service to its customers.” However, the statute, as well as the regulations, do not provide for awarding damages to a customer for the utility’s alleged failure to provide adequate service and remain completely silent as to the timeframe in which service must be provided or restored. If the statute or regulation “is silent or ambiguous with respect to the specific issue,” the court then must give deference to the agency’s interpretation of the statute or regulation.</w:t>
-      </w:r>
-      <w:r>
-        <w:t xml:space="preserve"> </w:t>
-      </w:r>
-      <w:r>
-        <w:rPr>
-          <w:i/>
-          <w:iCs/>
-        </w:rPr>
-        <w:t xml:space="preserve">Kiawah Development Partners,</w:t>
-      </w:r>
-      <w:r>
-        <w:rPr>
-          <w:i/>
-          <w:iCs/>
-        </w:rPr>
-        <w:t xml:space="preserve"> </w:t>
-      </w:r>
-      <w:r>
-        <w:rPr>
-          <w:i/>
-          <w:iCs/>
-        </w:rPr>
-        <w:t xml:space="preserve">II v. South Carolina Dept. of Health and Environmental Control</w:t>
-      </w:r>
-      <w:r>
-        <w:t xml:space="preserve">, 411 S.C. 16, 33, 766 S.E.2d 707, 717 (2014).</w:t>
-      </w:r>
-    </w:p>
-    <w:p>
-      <w:pPr>
-        <w:pStyle w:val="BodyText"/>
-      </w:pPr>
-      <w:r>
-        <w:t xml:space="preserve">There is and was no issue as to a lack of service provided to the Appellants’ residences at the time the Commission ruled on this case, as their service was previously restored in December 2018. (R. p. 4). Due to the Appellants’ water and sewer services being restored, that issue was moot prior to the time the Commission made its ruling in this case. (R. p. 4).</w:t>
-      </w:r>
-    </w:p>
-    <w:p>
-      <w:pPr>
-        <w:pStyle w:val="BodyText"/>
-      </w:pPr>
-      <w:r>
-        <w:t xml:space="preserve">The fact that a contract was not timely filed with the Commission (there is no specific time requirement in the Regulation) cannot and does not confer jurisdiction on the Appellants’ demand for monetary damages. Even if the Commission’s regulations required it to address the Appellants’ complaint regarding Respondent DIUC’s alleged failure to file the CSA, the Commission could, on Respondent DIUC’s Motion, waive the contract approval requirement provided in Regulation 103</w:t>
-      </w:r>
-      <w:r>
-        <w:noBreakHyphen/>
-      </w:r>
-      <w:r>
-        <w:t xml:space="preserve">743, based upon the underlying facts addressing claims for monetary damages. The proper forum for Respondent DIUC and Appellants’ rights and obligations under the CSA remain in the Court of Common Pleas, not before the Commission.</w:t>
-      </w:r>
-    </w:p>
-    <w:p>
-      <w:pPr>
-        <w:pStyle w:val="BodyText"/>
-      </w:pPr>
-      <w:r>
-        <w:t xml:space="preserve">The Commission was not required to address the issue of restoration of service for two substantial reasons: (1) service had already been restored by the time the case reached the Commission, therefore making the issue moot, and (2) the issue of a contract being filed with the Commission had no impact on the areas that the Commission does have jurisdiction– namely the actual provision of service. The Commission did not need to address the issue of the propriety of the terms of the CSA between the Appellants and Respondent DIUC not being filed with the Commission, as it has no statutory authority to award the monetary damages sought by the Appellants in their Complaint. There is no specific statutory relief fine or other regulatory action which the Commission is authorized to impose on a utility for failure to file a contract with the Commission.</w:t>
-      </w:r>
-    </w:p>
-    <w:p>
-      <w:pPr>
-        <w:pStyle w:val="BodyText"/>
-      </w:pPr>
-      <w:r>
-        <w:t xml:space="preserve">Fines and penalties may only be imposed under restricted circumstances under S.C. Code Ann. § 58</w:t>
-      </w:r>
-      <w:r>
-        <w:noBreakHyphen/>
-      </w:r>
-      <w:r>
-        <w:t xml:space="preserve">5</w:t>
-      </w:r>
-      <w:r>
-        <w:noBreakHyphen/>
-      </w:r>
-      <w:r>
-        <w:t xml:space="preserve">710 based on a finding of the Commission that the utility failed to provide “adequate and proper service” to its customers. The only other remaining possible remedies include the revocation of the utility’s certificate of public convenience and necessity or a change in the utilities rates. An action to revoke the certificate of a sewer utility and appoint a receiver under S.C. Code Ann. § 58</w:t>
-      </w:r>
-      <w:r>
-        <w:noBreakHyphen/>
-      </w:r>
-      <w:r>
-        <w:t xml:space="preserve">5</w:t>
-      </w:r>
-      <w:r>
-        <w:noBreakHyphen/>
-      </w:r>
-      <w:r>
-        <w:t xml:space="preserve">730</w:t>
+        <w:t xml:space="preserve">Fines and penalties may only be imposed under restricted circumstances under S.C. Code Ann. § 58-⁠5-⁠710 based on a finding of the Commission that the utility failed to provide “adequate and proper service” to its customers. The only other remaining possible remedies include the revocation of the utility’s certificate of public convenience and necessity or a change in the utilities rates. An action to revoke the certificate of a sewer utility and appoint a receiver under S.C. Code Ann. § 58-⁠5-⁠730</w:t>
       </w:r>
       <w:r>
         <w:t xml:space="preserve"> </w:t>
@@ -9862,19 +9728,7 @@
         <w:t xml:space="preserve"> </w:t>
       </w:r>
       <w:r>
-        <w:t xml:space="preserve">S.C. Code Ann. § 58</w:t>
-      </w:r>
-      <w:r>
-        <w:noBreakHyphen/>
-      </w:r>
-      <w:r>
-        <w:t xml:space="preserve">5</w:t>
-      </w:r>
-      <w:r>
-        <w:noBreakHyphen/>
-      </w:r>
-      <w:r>
-        <w:t xml:space="preserve">710.</w:t>
+        <w:t xml:space="preserve">S.C. Code Ann. § 58-⁠5-⁠710.</w:t>
       </w:r>
     </w:p>
   </w:footnote>
@@ -10024,19 +9878,7 @@
         <w:t xml:space="preserve"> </w:t>
       </w:r>
       <w:r>
-        <w:t xml:space="preserve">See S.C. Code Ann. § 58</w:t>
-      </w:r>
-      <w:r>
-        <w:noBreakHyphen/>
-      </w:r>
-      <w:r>
-        <w:t xml:space="preserve">4</w:t>
-      </w:r>
-      <w:r>
-        <w:noBreakHyphen/>
-      </w:r>
-      <w:r>
-        <w:t xml:space="preserve">50 (2019).</w:t>
+        <w:t xml:space="preserve">See S.C. Code Ann. § 58-⁠4-⁠50 (2019).</w:t>
       </w:r>
     </w:p>
   </w:footnote>
@@ -10605,19 +10447,7 @@
         <w:noBreakHyphen/>
       </w:r>
       <w:r>
-        <w:t xml:space="preserve">743; and S.C. Code Ann. § 58</w:t>
-      </w:r>
-      <w:r>
-        <w:noBreakHyphen/>
-      </w:r>
-      <w:r>
-        <w:t xml:space="preserve">5</w:t>
-      </w:r>
-      <w:r>
-        <w:noBreakHyphen/>
-      </w:r>
-      <w:r>
-        <w:t xml:space="preserve">710.</w:t>
+        <w:t xml:space="preserve">743; and S.C. Code Ann. § 58-⁠5-⁠710.</w:t>
       </w:r>
     </w:p>
   </w:footnote>
@@ -11359,6 +11189,7 @@
     <w:unhideWhenUsed/>
     <w:qFormat/>
     <w:pPr>
+      <w:keepLines/>
       <w:spacing w:before="0" w:after="140" w:line="276" w:lineRule="exact"/>
     </w:pPr>
     <w:rPr>
@@ -11609,6 +11440,33 @@
     <w:pPr>
       <w:spacing w:before="0" w:after="0" w:line="276" w:lineRule="exact"/>
       <w:ind w:left="2160" w:hanging="720"/>
+    </w:pPr>
+  </w:style>
+  <w:style w:type="paragraph" w:customStyle="1" w:styleId="XdQuoteList1">
+    <w:name w:val="Xd Quote List 1"/>
+    <w:basedOn w:val="Normal"/>
+    <w:qFormat/>
+    <w:pPr>
+      <w:spacing w:before="0" w:after="0" w:line="276" w:lineRule="exact"/>
+      <w:ind w:left="1440" w:right="720" w:hanging="720"/>
+    </w:pPr>
+  </w:style>
+  <w:style w:type="paragraph" w:customStyle="1" w:styleId="XdQuoteList2">
+    <w:name w:val="Xd Quote List 2"/>
+    <w:basedOn w:val="Normal"/>
+    <w:qFormat/>
+    <w:pPr>
+      <w:spacing w:before="0" w:after="0" w:line="276" w:lineRule="exact"/>
+      <w:ind w:left="2160" w:right="720" w:hanging="720"/>
+    </w:pPr>
+  </w:style>
+  <w:style w:type="paragraph" w:customStyle="1" w:styleId="XdQuoteList3">
+    <w:name w:val="Xd Quote List 3"/>
+    <w:basedOn w:val="Normal"/>
+    <w:qFormat/>
+    <w:pPr>
+      <w:spacing w:before="0" w:after="0" w:line="276" w:lineRule="exact"/>
+      <w:ind w:left="2880" w:right="720" w:hanging="720"/>
     </w:pPr>
   </w:style>
   <w:style w:type="paragraph" w:customStyle="1" w:styleId="XdQuoteOnly">

</xml_diff>